<commit_message>
Merged requirements documents together
</commit_message>
<xml_diff>
--- a/Key Documents/Word Doc Versions/TfL What-If Simulation Requirements Document.docx
+++ b/Key Documents/Word Doc Versions/TfL What-If Simulation Requirements Document.docx
@@ -99,8 +99,7 @@
     </w:p>
     <w:p>
       <w:pPr>
-        <w:pStyle w:val="ListParagraph"/>
-        <w:ind w:left="1440"/>
+        <w:ind w:left="720"/>
       </w:pPr>
       <w:r>
         <w:t>This document defines the functional and non-functional requirements for the London Underground Simulation Project. The system will simulate the London Underground network using real Transport for London (TfL) data to allow users to visualise routes, analyse disruptions and test network resilience through interactive scenario planning.</w:t>
@@ -136,11 +135,18 @@
     </w:p>
     <w:p>
       <w:pPr>
-        <w:pStyle w:val="ListParagraph"/>
-        <w:ind w:left="1440"/>
+        <w:ind w:left="720"/>
       </w:pPr>
       <w:r>
         <w:t xml:space="preserve">The system will provide an interactive, web-based simulation of the London Underground network. It will integrate real-time service data, support shortest-path routing, visualising network activity and allowing manual disruption testing. </w:t>
+      </w:r>
+    </w:p>
+    <w:p>
+      <w:pPr>
+        <w:ind w:left="720"/>
+      </w:pPr>
+      <w:r>
+        <w:t>The system does not handle fare calculation, ticketing, passenger accounts or real TfL operational control. It is intended for visualisation, routing and disruption analysis only.</w:t>
       </w:r>
     </w:p>
     <w:p>
@@ -184,7 +190,412 @@
         <w:pStyle w:val="ListParagraph"/>
       </w:pPr>
       <w:r>
-        <w:t>The system will consume TfL API data to construct a graph representation of the Underground network. A pathfinding algorithm will calculate optimal routes while the visual interface will display the network and simulation agents. Users may observe live conditions or create hypothetical disruption scenarios using the “What-If” simulation feature.</w:t>
+        <w:t xml:space="preserve">The system will consume TfL API data to construct a graph representation of the Underground network. </w:t>
+      </w:r>
+      <w:r>
+        <w:t xml:space="preserve">Stations are represented as graph nodes, while connections between stations are represented as edges. </w:t>
+      </w:r>
+      <w:r>
+        <w:t xml:space="preserve">A pathfinding algorithm will calculate optimal routes </w:t>
+      </w:r>
+      <w:r>
+        <w:t>between selected stations, and the frontend displays the network on an interactive map</w:t>
+      </w:r>
+      <w:r>
+        <w:t xml:space="preserve">. </w:t>
+      </w:r>
+    </w:p>
+    <w:p>
+      <w:pPr>
+        <w:pStyle w:val="ListParagraph"/>
+      </w:pPr>
+    </w:p>
+    <w:p>
+      <w:pPr>
+        <w:pStyle w:val="ListParagraph"/>
+      </w:pPr>
+      <w:r>
+        <w:t xml:space="preserve">Users </w:t>
+      </w:r>
+      <w:r>
+        <w:t>can either observe live network conditions or enable What-If mode to manually close stations and lines. These simulated disruptions are applied locally and do not alter live TfL data.</w:t>
+      </w:r>
+    </w:p>
+    <w:p>
+      <w:r>
+        <w:pict w14:anchorId="55D4BB9F">
+          <v:rect id="_x0000_i1036" style="width:0;height:1.5pt" o:hralign="center" o:hrstd="t" o:hr="t"/>
+        </w:pict>
+      </w:r>
+    </w:p>
+    <w:p>
+      <w:pPr>
+        <w:pStyle w:val="ListParagraph"/>
+        <w:numPr>
+          <w:ilvl w:val="0"/>
+          <w:numId w:val="1"/>
+        </w:numPr>
+        <w:rPr>
+          <w:rFonts w:asciiTheme="majorHAnsi" w:hAnsiTheme="majorHAnsi"/>
+          <w:b/>
+          <w:bCs/>
+          <w:color w:val="215E99" w:themeColor="text2" w:themeTint="BF"/>
+          <w:sz w:val="32"/>
+          <w:szCs w:val="32"/>
+        </w:rPr>
+      </w:pPr>
+      <w:r>
+        <w:rPr>
+          <w:rFonts w:asciiTheme="majorHAnsi" w:hAnsiTheme="majorHAnsi"/>
+          <w:b/>
+          <w:bCs/>
+          <w:color w:val="215E99" w:themeColor="text2" w:themeTint="BF"/>
+          <w:sz w:val="32"/>
+          <w:szCs w:val="32"/>
+        </w:rPr>
+        <w:t>User Classes</w:t>
+      </w:r>
+    </w:p>
+    <w:tbl>
+      <w:tblPr>
+        <w:tblStyle w:val="Table"/>
+        <w:tblW w:w="5000" w:type="pct"/>
+        <w:tblLayout w:type="fixed"/>
+        <w:tblLook w:val="0020" w:firstRow="1" w:lastRow="0" w:firstColumn="0" w:lastColumn="0" w:noHBand="0" w:noVBand="0"/>
+      </w:tblPr>
+      <w:tblGrid>
+        <w:gridCol w:w="4511"/>
+        <w:gridCol w:w="4515"/>
+      </w:tblGrid>
+      <w:tr>
+        <w:trPr>
+          <w:cnfStyle w:val="100000000000" w:firstRow="1" w:lastRow="0" w:firstColumn="0" w:lastColumn="0" w:oddVBand="0" w:evenVBand="0" w:oddHBand="0" w:evenHBand="0" w:firstRowFirstColumn="0" w:firstRowLastColumn="0" w:lastRowFirstColumn="0" w:lastRowLastColumn="0"/>
+          <w:trHeight w:val="391"/>
+          <w:tblHeader/>
+        </w:trPr>
+        <w:tc>
+          <w:tcPr>
+            <w:tcW w:w="4511" w:type="dxa"/>
+          </w:tcPr>
+          <w:p>
+            <w:pPr>
+              <w:pStyle w:val="Compact"/>
+              <w:rPr>
+                <w:b/>
+                <w:bCs/>
+                <w:sz w:val="24"/>
+                <w:szCs w:val="24"/>
+              </w:rPr>
+            </w:pPr>
+            <w:r>
+              <w:rPr>
+                <w:b/>
+                <w:bCs/>
+                <w:sz w:val="24"/>
+                <w:szCs w:val="24"/>
+              </w:rPr>
+              <w:t>User Class</w:t>
+            </w:r>
+          </w:p>
+        </w:tc>
+        <w:tc>
+          <w:tcPr>
+            <w:tcW w:w="4515" w:type="dxa"/>
+          </w:tcPr>
+          <w:p>
+            <w:pPr>
+              <w:pStyle w:val="Compact"/>
+              <w:rPr>
+                <w:b/>
+                <w:bCs/>
+                <w:sz w:val="24"/>
+                <w:szCs w:val="24"/>
+              </w:rPr>
+            </w:pPr>
+            <w:r>
+              <w:rPr>
+                <w:b/>
+                <w:bCs/>
+                <w:sz w:val="24"/>
+                <w:szCs w:val="24"/>
+              </w:rPr>
+              <w:t>Description</w:t>
+            </w:r>
+          </w:p>
+        </w:tc>
+      </w:tr>
+      <w:tr>
+        <w:trPr>
+          <w:trHeight w:val="403"/>
+        </w:trPr>
+        <w:tc>
+          <w:tcPr>
+            <w:tcW w:w="4511" w:type="dxa"/>
+          </w:tcPr>
+          <w:p>
+            <w:pPr>
+              <w:pStyle w:val="Compact"/>
+            </w:pPr>
+            <w:r>
+              <w:rPr>
+                <w:rStyle w:val="VerbatimChar"/>
+                <w:rFonts w:asciiTheme="minorHAnsi" w:hAnsiTheme="minorHAnsi"/>
+              </w:rPr>
+              <w:t>Commuter</w:t>
+            </w:r>
+          </w:p>
+        </w:tc>
+        <w:tc>
+          <w:tcPr>
+            <w:tcW w:w="4515" w:type="dxa"/>
+          </w:tcPr>
+          <w:p>
+            <w:pPr>
+              <w:pStyle w:val="Compact"/>
+            </w:pPr>
+            <w:r>
+              <w:t>A casual user exploring journeys and disruption effects.</w:t>
+            </w:r>
+          </w:p>
+        </w:tc>
+      </w:tr>
+      <w:tr>
+        <w:trPr>
+          <w:trHeight w:val="391"/>
+        </w:trPr>
+        <w:tc>
+          <w:tcPr>
+            <w:tcW w:w="4511" w:type="dxa"/>
+          </w:tcPr>
+          <w:p>
+            <w:pPr>
+              <w:pStyle w:val="Compact"/>
+            </w:pPr>
+            <w:r>
+              <w:rPr>
+                <w:rStyle w:val="VerbatimChar"/>
+                <w:rFonts w:asciiTheme="minorHAnsi" w:hAnsiTheme="minorHAnsi"/>
+              </w:rPr>
+              <w:t>Transpo</w:t>
+            </w:r>
+            <w:r>
+              <w:rPr>
+                <w:rStyle w:val="VerbatimChar"/>
+                <w:rFonts w:asciiTheme="minorHAnsi" w:hAnsiTheme="minorHAnsi"/>
+              </w:rPr>
+              <w:t>rt Analyst</w:t>
+            </w:r>
+          </w:p>
+        </w:tc>
+        <w:tc>
+          <w:tcPr>
+            <w:tcW w:w="4515" w:type="dxa"/>
+          </w:tcPr>
+          <w:p>
+            <w:pPr>
+              <w:pStyle w:val="Compact"/>
+            </w:pPr>
+            <w:r>
+              <w:t>A user analysing network behaviour under disruption.</w:t>
+            </w:r>
+          </w:p>
+        </w:tc>
+      </w:tr>
+      <w:tr>
+        <w:trPr>
+          <w:trHeight w:val="403"/>
+        </w:trPr>
+        <w:tc>
+          <w:tcPr>
+            <w:tcW w:w="4511" w:type="dxa"/>
+          </w:tcPr>
+          <w:p>
+            <w:pPr>
+              <w:pStyle w:val="Compact"/>
+            </w:pPr>
+            <w:r>
+              <w:rPr>
+                <w:rStyle w:val="VerbatimChar"/>
+                <w:rFonts w:asciiTheme="minorHAnsi" w:hAnsiTheme="minorHAnsi"/>
+              </w:rPr>
+              <w:t>Plannner</w:t>
+            </w:r>
+          </w:p>
+        </w:tc>
+        <w:tc>
+          <w:tcPr>
+            <w:tcW w:w="4515" w:type="dxa"/>
+          </w:tcPr>
+          <w:p>
+            <w:pPr>
+              <w:pStyle w:val="Compact"/>
+            </w:pPr>
+            <w:r>
+              <w:t>A user testing hypothetical closure scenarios.</w:t>
+            </w:r>
+          </w:p>
+        </w:tc>
+      </w:tr>
+      <w:tr>
+        <w:trPr>
+          <w:trHeight w:val="391"/>
+        </w:trPr>
+        <w:tc>
+          <w:tcPr>
+            <w:tcW w:w="4511" w:type="dxa"/>
+          </w:tcPr>
+          <w:p>
+            <w:pPr>
+              <w:pStyle w:val="Compact"/>
+            </w:pPr>
+            <w:r>
+              <w:rPr>
+                <w:rStyle w:val="VerbatimChar"/>
+                <w:rFonts w:asciiTheme="minorHAnsi" w:hAnsiTheme="minorHAnsi"/>
+              </w:rPr>
+              <w:lastRenderedPageBreak/>
+              <w:t>Academic Assessor</w:t>
+            </w:r>
+          </w:p>
+        </w:tc>
+        <w:tc>
+          <w:tcPr>
+            <w:tcW w:w="4515" w:type="dxa"/>
+          </w:tcPr>
+          <w:p>
+            <w:pPr>
+              <w:pStyle w:val="Compact"/>
+            </w:pPr>
+            <w:r>
+              <w:t>A user reviewing system correctness and implementation quality.</w:t>
+            </w:r>
+          </w:p>
+        </w:tc>
+      </w:tr>
+    </w:tbl>
+    <w:p>
+      <w:r>
+        <w:pict w14:anchorId="3188EA13">
+          <v:rect id="_x0000_i1037" style="width:0;height:1.5pt" o:hralign="center" o:hrstd="t" o:hr="t"/>
+        </w:pict>
+      </w:r>
+    </w:p>
+    <w:p>
+      <w:pPr>
+        <w:pStyle w:val="ListParagraph"/>
+        <w:numPr>
+          <w:ilvl w:val="0"/>
+          <w:numId w:val="1"/>
+        </w:numPr>
+        <w:rPr>
+          <w:rFonts w:asciiTheme="majorHAnsi" w:hAnsiTheme="majorHAnsi"/>
+          <w:b/>
+          <w:bCs/>
+          <w:color w:val="215E99" w:themeColor="text2" w:themeTint="BF"/>
+          <w:sz w:val="32"/>
+          <w:szCs w:val="32"/>
+        </w:rPr>
+      </w:pPr>
+      <w:r>
+        <w:rPr>
+          <w:rFonts w:asciiTheme="majorHAnsi" w:hAnsiTheme="majorHAnsi"/>
+          <w:b/>
+          <w:bCs/>
+          <w:color w:val="215E99" w:themeColor="text2" w:themeTint="BF"/>
+          <w:sz w:val="32"/>
+          <w:szCs w:val="32"/>
+        </w:rPr>
+        <w:t>Operating Environment</w:t>
+      </w:r>
+    </w:p>
+    <w:p>
+      <w:pPr>
+        <w:pStyle w:val="ListParagraph"/>
+        <w:numPr>
+          <w:ilvl w:val="0"/>
+          <w:numId w:val="7"/>
+        </w:numPr>
+        <w:rPr>
+          <w:color w:val="000000" w:themeColor="text1"/>
+        </w:rPr>
+      </w:pPr>
+      <w:r>
+        <w:rPr>
+          <w:color w:val="000000" w:themeColor="text1"/>
+        </w:rPr>
+        <w:t>Client – Modern web browsers such as Chrome, Edge, Firefox and mobile browsers.</w:t>
+      </w:r>
+    </w:p>
+    <w:p>
+      <w:pPr>
+        <w:pStyle w:val="ListParagraph"/>
+        <w:numPr>
+          <w:ilvl w:val="0"/>
+          <w:numId w:val="7"/>
+        </w:numPr>
+        <w:rPr>
+          <w:color w:val="000000" w:themeColor="text1"/>
+        </w:rPr>
+      </w:pPr>
+      <w:r>
+        <w:rPr>
+          <w:color w:val="000000" w:themeColor="text1"/>
+        </w:rPr>
+        <w:t>Backend Runtime – Next.js.</w:t>
+      </w:r>
+    </w:p>
+    <w:p>
+      <w:pPr>
+        <w:pStyle w:val="ListParagraph"/>
+        <w:numPr>
+          <w:ilvl w:val="0"/>
+          <w:numId w:val="7"/>
+        </w:numPr>
+        <w:rPr>
+          <w:color w:val="000000" w:themeColor="text1"/>
+        </w:rPr>
+      </w:pPr>
+      <w:r>
+        <w:rPr>
+          <w:color w:val="000000" w:themeColor="text1"/>
+        </w:rPr>
+        <w:t>Database – Neo4j graph database.</w:t>
+      </w:r>
+    </w:p>
+    <w:p>
+      <w:pPr>
+        <w:pStyle w:val="ListParagraph"/>
+        <w:numPr>
+          <w:ilvl w:val="0"/>
+          <w:numId w:val="7"/>
+        </w:numPr>
+        <w:rPr>
+          <w:color w:val="000000" w:themeColor="text1"/>
+        </w:rPr>
+      </w:pPr>
+      <w:r>
+        <w:rPr>
+          <w:color w:val="000000" w:themeColor="text1"/>
+        </w:rPr>
+        <w:t>External Data Source – TfL Unified API.</w:t>
+      </w:r>
+    </w:p>
+    <w:p>
+      <w:pPr>
+        <w:pStyle w:val="ListParagraph"/>
+        <w:numPr>
+          <w:ilvl w:val="0"/>
+          <w:numId w:val="7"/>
+        </w:numPr>
+        <w:rPr>
+          <w:color w:val="000000" w:themeColor="text1"/>
+        </w:rPr>
+      </w:pPr>
+      <w:r>
+        <w:rPr>
+          <w:color w:val="000000" w:themeColor="text1"/>
+        </w:rPr>
+        <w:t>Network – Internet connectivity is required for live TfL data.</w:t>
       </w:r>
     </w:p>
     <w:p>
@@ -439,7 +850,6 @@
           <w:sz w:val="28"/>
           <w:szCs w:val="28"/>
         </w:rPr>
-        <w:lastRenderedPageBreak/>
         <w:t>Real-Time Status Updates</w:t>
       </w:r>
     </w:p>
@@ -608,6 +1018,7 @@
         <w:ind w:left="1080"/>
       </w:pPr>
       <w:r>
+        <w:lastRenderedPageBreak/>
         <w:t>The system shall allow users to manually close or reopen stations and lines.</w:t>
       </w:r>
     </w:p>
@@ -984,12 +1395,127 @@
       </w:r>
     </w:p>
     <w:p>
-      <w:pPr>
-        <w:pStyle w:val="ListParagraph"/>
-        <w:rPr>
-          <w:u w:val="single"/>
-        </w:rPr>
-      </w:pPr>
+      <w:r>
+        <w:pict w14:anchorId="79E72F75">
+          <v:rect id="_x0000_i1041" style="width:0;height:1.5pt" o:hralign="center" o:bullet="t" o:hrstd="t" o:hr="t"/>
+        </w:pict>
+      </w:r>
+    </w:p>
+    <w:p>
+      <w:pPr>
+        <w:pStyle w:val="ListParagraph"/>
+        <w:numPr>
+          <w:ilvl w:val="0"/>
+          <w:numId w:val="1"/>
+        </w:numPr>
+        <w:rPr>
+          <w:b/>
+          <w:bCs/>
+          <w:color w:val="215E99" w:themeColor="text2" w:themeTint="BF"/>
+          <w:sz w:val="32"/>
+          <w:szCs w:val="32"/>
+        </w:rPr>
+      </w:pPr>
+      <w:r>
+        <w:rPr>
+          <w:b/>
+          <w:bCs/>
+          <w:color w:val="215E99" w:themeColor="text2" w:themeTint="BF"/>
+          <w:sz w:val="32"/>
+          <w:szCs w:val="32"/>
+        </w:rPr>
+        <w:t>Assumptions and Dependencies</w:t>
+      </w:r>
+    </w:p>
+    <w:p>
+      <w:pPr>
+        <w:pStyle w:val="ListParagraph"/>
+        <w:numPr>
+          <w:ilvl w:val="0"/>
+          <w:numId w:val="8"/>
+        </w:numPr>
+        <w:rPr>
+          <w:color w:val="000000" w:themeColor="text1"/>
+        </w:rPr>
+      </w:pPr>
+      <w:r>
+        <w:rPr>
+          <w:color w:val="000000" w:themeColor="text1"/>
+        </w:rPr>
+        <w:t>TfL Unified API remains accessible and stable.</w:t>
+      </w:r>
+    </w:p>
+    <w:p>
+      <w:pPr>
+        <w:pStyle w:val="ListParagraph"/>
+        <w:numPr>
+          <w:ilvl w:val="0"/>
+          <w:numId w:val="8"/>
+        </w:numPr>
+        <w:rPr>
+          <w:color w:val="000000" w:themeColor="text1"/>
+        </w:rPr>
+      </w:pPr>
+      <w:r>
+        <w:rPr>
+          <w:color w:val="000000" w:themeColor="text1"/>
+        </w:rPr>
+        <w:t>TfL data accuracy is dependent on the external API provider.</w:t>
+      </w:r>
+    </w:p>
+    <w:p>
+      <w:pPr>
+        <w:pStyle w:val="ListParagraph"/>
+        <w:numPr>
+          <w:ilvl w:val="0"/>
+          <w:numId w:val="8"/>
+        </w:numPr>
+        <w:rPr>
+          <w:color w:val="000000" w:themeColor="text1"/>
+        </w:rPr>
+      </w:pPr>
+      <w:r>
+        <w:rPr>
+          <w:color w:val="000000" w:themeColor="text1"/>
+        </w:rPr>
+        <w:t>The London Underground topology does not change frequently.</w:t>
+      </w:r>
+    </w:p>
+    <w:p>
+      <w:pPr>
+        <w:pStyle w:val="ListParagraph"/>
+        <w:numPr>
+          <w:ilvl w:val="0"/>
+          <w:numId w:val="8"/>
+        </w:numPr>
+        <w:rPr>
+          <w:color w:val="000000" w:themeColor="text1"/>
+        </w:rPr>
+      </w:pPr>
+      <w:r>
+        <w:rPr>
+          <w:color w:val="000000" w:themeColor="text1"/>
+        </w:rPr>
+        <w:t>Users have internet access for live data features.</w:t>
+      </w:r>
+    </w:p>
+    <w:p>
+      <w:pPr>
+        <w:pStyle w:val="ListParagraph"/>
+        <w:numPr>
+          <w:ilvl w:val="0"/>
+          <w:numId w:val="8"/>
+        </w:numPr>
+        <w:rPr>
+          <w:color w:val="000000" w:themeColor="text1"/>
+        </w:rPr>
+      </w:pPr>
+      <w:r>
+        <w:rPr>
+          <w:color w:val="000000" w:themeColor="text1"/>
+        </w:rPr>
+        <w:t>The Neo4j database is available when the application requires graph data.</w:t>
+      </w:r>
     </w:p>
     <w:sectPr>
       <w:pgSz w:w="11906" w:h="16838"/>
@@ -1001,16 +1527,71 @@
 </w:document>
 </file>
 
+<file path=word/endnotes.xml><?xml version="1.0" encoding="utf-8"?>
+<w:endnotes xmlns:wpc="http://schemas.microsoft.com/office/word/2010/wordprocessingCanvas" xmlns:cx="http://schemas.microsoft.com/office/drawing/2014/chartex" xmlns:cx1="http://schemas.microsoft.com/office/drawing/2015/9/8/chartex" xmlns:cx2="http://schemas.microsoft.com/office/drawing/2015/10/21/chartex" xmlns:cx3="http://schemas.microsoft.com/office/drawing/2016/5/9/chartex" xmlns:cx4="http://schemas.microsoft.com/office/drawing/2016/5/10/chartex" xmlns:cx5="http://schemas.microsoft.com/office/drawing/2016/5/11/chartex" xmlns:cx6="http://schemas.microsoft.com/office/drawing/2016/5/12/chartex" xmlns:cx7="http://schemas.microsoft.com/office/drawing/2016/5/13/chartex" xmlns:cx8="http://schemas.microsoft.com/office/drawing/2016/5/14/chartex" xmlns:mc="http://schemas.openxmlformats.org/markup-compatibility/2006" xmlns:aink="http://schemas.microsoft.com/office/drawing/2016/ink" xmlns:am3d="http://schemas.microsoft.com/office/drawing/2017/model3d" xmlns:o="urn:schemas-microsoft-com:office:office" xmlns:oel="http://schemas.microsoft.com/office/2019/extlst" xmlns:r="http://schemas.openxmlformats.org/officeDocument/2006/relationships" xmlns:m="http://schemas.openxmlformats.org/officeDocument/2006/math" xmlns:v="urn:schemas-microsoft-com:vml" xmlns:wp14="http://schemas.microsoft.com/office/word/2010/wordprocessingDrawing" xmlns:wp="http://schemas.openxmlformats.org/drawingml/2006/wordprocessingDrawing" xmlns:w10="urn:schemas-microsoft-com:office:word" xmlns:w="http://schemas.openxmlformats.org/wordprocessingml/2006/main" xmlns:w14="http://schemas.microsoft.com/office/word/2010/wordml" xmlns:w15="http://schemas.microsoft.com/office/word/2012/wordml" xmlns:w16cex="http://schemas.microsoft.com/office/word/2018/wordml/cex" xmlns:w16cid="http://schemas.microsoft.com/office/word/2016/wordml/cid" xmlns:w16="http://schemas.microsoft.com/office/word/2018/wordml" xmlns:w16du="http://schemas.microsoft.com/office/word/2023/wordml/word16du" xmlns:w16sdtdh="http://schemas.microsoft.com/office/word/2020/wordml/sdtdatahash" xmlns:w16sdtfl="http://schemas.microsoft.com/office/word/2024/wordml/sdtformatlock" xmlns:w16se="http://schemas.microsoft.com/office/word/2015/wordml/symex" xmlns:wpg="http://schemas.microsoft.com/office/word/2010/wordprocessingGroup" xmlns:wpi="http://schemas.microsoft.com/office/word/2010/wordprocessingInk" xmlns:wne="http://schemas.microsoft.com/office/word/2006/wordml" xmlns:wps="http://schemas.microsoft.com/office/word/2010/wordprocessingShape" mc:Ignorable="w14 w15 w16se w16cid w16 w16cex w16sdtdh w16sdtfl w16du wp14">
+  <w:endnote w:type="separator" w:id="-1">
+    <w:p>
+      <w:pPr>
+        <w:spacing w:after="0" w:line="240" w:lineRule="auto"/>
+      </w:pPr>
+      <w:r>
+        <w:separator/>
+      </w:r>
+    </w:p>
+  </w:endnote>
+  <w:endnote w:type="continuationSeparator" w:id="0">
+    <w:p>
+      <w:pPr>
+        <w:spacing w:after="0" w:line="240" w:lineRule="auto"/>
+      </w:pPr>
+      <w:r>
+        <w:continuationSeparator/>
+      </w:r>
+    </w:p>
+  </w:endnote>
+</w:endnotes>
+</file>
+
+<file path=word/footnotes.xml><?xml version="1.0" encoding="utf-8"?>
+<w:footnotes xmlns:wpc="http://schemas.microsoft.com/office/word/2010/wordprocessingCanvas" xmlns:cx="http://schemas.microsoft.com/office/drawing/2014/chartex" xmlns:cx1="http://schemas.microsoft.com/office/drawing/2015/9/8/chartex" xmlns:cx2="http://schemas.microsoft.com/office/drawing/2015/10/21/chartex" xmlns:cx3="http://schemas.microsoft.com/office/drawing/2016/5/9/chartex" xmlns:cx4="http://schemas.microsoft.com/office/drawing/2016/5/10/chartex" xmlns:cx5="http://schemas.microsoft.com/office/drawing/2016/5/11/chartex" xmlns:cx6="http://schemas.microsoft.com/office/drawing/2016/5/12/chartex" xmlns:cx7="http://schemas.microsoft.com/office/drawing/2016/5/13/chartex" xmlns:cx8="http://schemas.microsoft.com/office/drawing/2016/5/14/chartex" xmlns:mc="http://schemas.openxmlformats.org/markup-compatibility/2006" xmlns:aink="http://schemas.microsoft.com/office/drawing/2016/ink" xmlns:am3d="http://schemas.microsoft.com/office/drawing/2017/model3d" xmlns:o="urn:schemas-microsoft-com:office:office" xmlns:oel="http://schemas.microsoft.com/office/2019/extlst" xmlns:r="http://schemas.openxmlformats.org/officeDocument/2006/relationships" xmlns:m="http://schemas.openxmlformats.org/officeDocument/2006/math" xmlns:v="urn:schemas-microsoft-com:vml" xmlns:wp14="http://schemas.microsoft.com/office/word/2010/wordprocessingDrawing" xmlns:wp="http://schemas.openxmlformats.org/drawingml/2006/wordprocessingDrawing" xmlns:w10="urn:schemas-microsoft-com:office:word" xmlns:w="http://schemas.openxmlformats.org/wordprocessingml/2006/main" xmlns:w14="http://schemas.microsoft.com/office/word/2010/wordml" xmlns:w15="http://schemas.microsoft.com/office/word/2012/wordml" xmlns:w16cex="http://schemas.microsoft.com/office/word/2018/wordml/cex" xmlns:w16cid="http://schemas.microsoft.com/office/word/2016/wordml/cid" xmlns:w16="http://schemas.microsoft.com/office/word/2018/wordml" xmlns:w16du="http://schemas.microsoft.com/office/word/2023/wordml/word16du" xmlns:w16sdtdh="http://schemas.microsoft.com/office/word/2020/wordml/sdtdatahash" xmlns:w16sdtfl="http://schemas.microsoft.com/office/word/2024/wordml/sdtformatlock" xmlns:w16se="http://schemas.microsoft.com/office/word/2015/wordml/symex" xmlns:wpg="http://schemas.microsoft.com/office/word/2010/wordprocessingGroup" xmlns:wpi="http://schemas.microsoft.com/office/word/2010/wordprocessingInk" xmlns:wne="http://schemas.microsoft.com/office/word/2006/wordml" xmlns:wps="http://schemas.microsoft.com/office/word/2010/wordprocessingShape" mc:Ignorable="w14 w15 w16se w16cid w16 w16cex w16sdtdh w16sdtfl w16du wp14">
+  <w:footnote w:type="separator" w:id="-1">
+    <w:p>
+      <w:pPr>
+        <w:spacing w:after="0" w:line="240" w:lineRule="auto"/>
+      </w:pPr>
+      <w:r>
+        <w:separator/>
+      </w:r>
+    </w:p>
+  </w:footnote>
+  <w:footnote w:type="continuationSeparator" w:id="0">
+    <w:p>
+      <w:pPr>
+        <w:spacing w:after="0" w:line="240" w:lineRule="auto"/>
+      </w:pPr>
+      <w:r>
+        <w:continuationSeparator/>
+      </w:r>
+    </w:p>
+  </w:footnote>
+</w:footnotes>
+</file>
+
 <file path=word/numbering.xml><?xml version="1.0" encoding="utf-8"?>
 <w:numbering xmlns:wpc="http://schemas.microsoft.com/office/word/2010/wordprocessingCanvas" xmlns:cx="http://schemas.microsoft.com/office/drawing/2014/chartex" xmlns:cx1="http://schemas.microsoft.com/office/drawing/2015/9/8/chartex" xmlns:cx2="http://schemas.microsoft.com/office/drawing/2015/10/21/chartex" xmlns:cx3="http://schemas.microsoft.com/office/drawing/2016/5/9/chartex" xmlns:cx4="http://schemas.microsoft.com/office/drawing/2016/5/10/chartex" xmlns:cx5="http://schemas.microsoft.com/office/drawing/2016/5/11/chartex" xmlns:cx6="http://schemas.microsoft.com/office/drawing/2016/5/12/chartex" xmlns:cx7="http://schemas.microsoft.com/office/drawing/2016/5/13/chartex" xmlns:cx8="http://schemas.microsoft.com/office/drawing/2016/5/14/chartex" xmlns:mc="http://schemas.openxmlformats.org/markup-compatibility/2006" xmlns:aink="http://schemas.microsoft.com/office/drawing/2016/ink" xmlns:am3d="http://schemas.microsoft.com/office/drawing/2017/model3d" xmlns:o="urn:schemas-microsoft-com:office:office" xmlns:oel="http://schemas.microsoft.com/office/2019/extlst" xmlns:r="http://schemas.openxmlformats.org/officeDocument/2006/relationships" xmlns:m="http://schemas.openxmlformats.org/officeDocument/2006/math" xmlns:v="urn:schemas-microsoft-com:vml" xmlns:wp14="http://schemas.microsoft.com/office/word/2010/wordprocessingDrawing" xmlns:wp="http://schemas.openxmlformats.org/drawingml/2006/wordprocessingDrawing" xmlns:w10="urn:schemas-microsoft-com:office:word" xmlns:w="http://schemas.openxmlformats.org/wordprocessingml/2006/main" xmlns:w14="http://schemas.microsoft.com/office/word/2010/wordml" xmlns:w15="http://schemas.microsoft.com/office/word/2012/wordml" xmlns:w16cex="http://schemas.microsoft.com/office/word/2018/wordml/cex" xmlns:w16cid="http://schemas.microsoft.com/office/word/2016/wordml/cid" xmlns:w16="http://schemas.microsoft.com/office/word/2018/wordml" xmlns:w16du="http://schemas.microsoft.com/office/word/2023/wordml/word16du" xmlns:w16sdtdh="http://schemas.microsoft.com/office/word/2020/wordml/sdtdatahash" xmlns:w16sdtfl="http://schemas.microsoft.com/office/word/2024/wordml/sdtformatlock" xmlns:w16se="http://schemas.microsoft.com/office/word/2015/wordml/symex" xmlns:wpg="http://schemas.microsoft.com/office/word/2010/wordprocessingGroup" xmlns:wpi="http://schemas.microsoft.com/office/word/2010/wordprocessingInk" xmlns:wne="http://schemas.microsoft.com/office/word/2006/wordml" xmlns:wps="http://schemas.microsoft.com/office/word/2010/wordprocessingShape" mc:Ignorable="w14 w15 w16se w16cid w16 w16cex w16sdtdh w16sdtfl w16du wp14">
+  <w:numPicBullet w:numPicBulletId="0">
+    <w:pict>
+      <v:rect id="_x0000_i1025" style="width:0;height:1.5pt" o:hralign="center" o:bullet="t" o:hrstd="t" o:hr="t"/>
+    </w:pict>
+  </w:numPicBullet>
   <w:abstractNum w:abstractNumId="0" w15:restartNumberingAfterBreak="0">
     <w:nsid w:val="033C4965"/>
     <w:multiLevelType w:val="hybridMultilevel"/>
-    <w:tmpl w:val="13CAAB44"/>
-    <w:lvl w:ilvl="0" w:tplc="F9C2279A">
+    <w:tmpl w:val="BFA0E4DC"/>
+    <w:lvl w:ilvl="0" w:tplc="883E232A">
       <w:start w:val="1"/>
       <w:numFmt w:val="decimal"/>
-      <w:lvlText w:val="4.%1"/>
+      <w:lvlText w:val="6.%1"/>
       <w:lvlJc w:val="left"/>
       <w:pPr>
         <w:ind w:left="1440" w:hanging="360"/>
@@ -1096,7 +1677,7 @@
   <w:abstractNum w:abstractNumId="1" w15:restartNumberingAfterBreak="0">
     <w:nsid w:val="040F587A"/>
     <w:multiLevelType w:val="hybridMultilevel"/>
-    <w:tmpl w:val="094636FE"/>
+    <w:tmpl w:val="42CA91F4"/>
     <w:lvl w:ilvl="0" w:tplc="08090001">
       <w:start w:val="1"/>
       <w:numFmt w:val="bullet"/>
@@ -1109,7 +1690,7 @@
         <w:rFonts w:ascii="Symbol" w:hAnsi="Symbol" w:hint="default"/>
       </w:rPr>
     </w:lvl>
-    <w:lvl w:ilvl="1" w:tplc="08090003" w:tentative="1">
+    <w:lvl w:ilvl="1" w:tplc="08090003">
       <w:start w:val="1"/>
       <w:numFmt w:val="bullet"/>
       <w:lvlText w:val="o"/>
@@ -1121,7 +1702,7 @@
         <w:rFonts w:ascii="Courier New" w:hAnsi="Courier New" w:cs="Courier New" w:hint="default"/>
       </w:rPr>
     </w:lvl>
-    <w:lvl w:ilvl="2" w:tplc="08090005" w:tentative="1">
+    <w:lvl w:ilvl="2" w:tplc="08090005">
       <w:start w:val="1"/>
       <w:numFmt w:val="bullet"/>
       <w:lvlText w:val=""/>
@@ -1133,7 +1714,7 @@
         <w:rFonts w:ascii="Wingdings" w:hAnsi="Wingdings" w:hint="default"/>
       </w:rPr>
     </w:lvl>
-    <w:lvl w:ilvl="3" w:tplc="08090001" w:tentative="1">
+    <w:lvl w:ilvl="3" w:tplc="08090001">
       <w:start w:val="1"/>
       <w:numFmt w:val="bullet"/>
       <w:lvlText w:val=""/>
@@ -1145,7 +1726,7 @@
         <w:rFonts w:ascii="Symbol" w:hAnsi="Symbol" w:hint="default"/>
       </w:rPr>
     </w:lvl>
-    <w:lvl w:ilvl="4" w:tplc="08090003" w:tentative="1">
+    <w:lvl w:ilvl="4" w:tplc="08090003">
       <w:start w:val="1"/>
       <w:numFmt w:val="bullet"/>
       <w:lvlText w:val="o"/>
@@ -1157,7 +1738,7 @@
         <w:rFonts w:ascii="Courier New" w:hAnsi="Courier New" w:cs="Courier New" w:hint="default"/>
       </w:rPr>
     </w:lvl>
-    <w:lvl w:ilvl="5" w:tplc="08090005" w:tentative="1">
+    <w:lvl w:ilvl="5" w:tplc="08090005">
       <w:start w:val="1"/>
       <w:numFmt w:val="bullet"/>
       <w:lvlText w:val=""/>
@@ -1169,7 +1750,7 @@
         <w:rFonts w:ascii="Wingdings" w:hAnsi="Wingdings" w:hint="default"/>
       </w:rPr>
     </w:lvl>
-    <w:lvl w:ilvl="6" w:tplc="08090001" w:tentative="1">
+    <w:lvl w:ilvl="6" w:tplc="08090001">
       <w:start w:val="1"/>
       <w:numFmt w:val="bullet"/>
       <w:lvlText w:val=""/>
@@ -1181,7 +1762,7 @@
         <w:rFonts w:ascii="Symbol" w:hAnsi="Symbol" w:hint="default"/>
       </w:rPr>
     </w:lvl>
-    <w:lvl w:ilvl="7" w:tplc="08090003" w:tentative="1">
+    <w:lvl w:ilvl="7" w:tplc="08090003">
       <w:start w:val="1"/>
       <w:numFmt w:val="bullet"/>
       <w:lvlText w:val="o"/>
@@ -1193,7 +1774,7 @@
         <w:rFonts w:ascii="Courier New" w:hAnsi="Courier New" w:cs="Courier New" w:hint="default"/>
       </w:rPr>
     </w:lvl>
-    <w:lvl w:ilvl="8" w:tplc="08090005" w:tentative="1">
+    <w:lvl w:ilvl="8" w:tplc="08090005">
       <w:start w:val="1"/>
       <w:numFmt w:val="bullet"/>
       <w:lvlText w:val=""/>
@@ -1447,6 +2028,346 @@
     </w:lvl>
   </w:abstractNum>
   <w:abstractNum w:abstractNumId="4" w15:restartNumberingAfterBreak="0">
+    <w:nsid w:val="2D025D0C"/>
+    <w:multiLevelType w:val="hybridMultilevel"/>
+    <w:tmpl w:val="BCEE7A40"/>
+    <w:lvl w:ilvl="0" w:tplc="08090001">
+      <w:start w:val="1"/>
+      <w:numFmt w:val="bullet"/>
+      <w:lvlText w:val=""/>
+      <w:lvlJc w:val="left"/>
+      <w:pPr>
+        <w:ind w:left="1080" w:hanging="360"/>
+      </w:pPr>
+      <w:rPr>
+        <w:rFonts w:ascii="Symbol" w:hAnsi="Symbol" w:hint="default"/>
+      </w:rPr>
+    </w:lvl>
+    <w:lvl w:ilvl="1" w:tplc="08090003" w:tentative="1">
+      <w:start w:val="1"/>
+      <w:numFmt w:val="bullet"/>
+      <w:lvlText w:val="o"/>
+      <w:lvlJc w:val="left"/>
+      <w:pPr>
+        <w:ind w:left="1800" w:hanging="360"/>
+      </w:pPr>
+      <w:rPr>
+        <w:rFonts w:ascii="Courier New" w:hAnsi="Courier New" w:cs="Courier New" w:hint="default"/>
+      </w:rPr>
+    </w:lvl>
+    <w:lvl w:ilvl="2" w:tplc="08090005" w:tentative="1">
+      <w:start w:val="1"/>
+      <w:numFmt w:val="bullet"/>
+      <w:lvlText w:val=""/>
+      <w:lvlJc w:val="left"/>
+      <w:pPr>
+        <w:ind w:left="2520" w:hanging="360"/>
+      </w:pPr>
+      <w:rPr>
+        <w:rFonts w:ascii="Wingdings" w:hAnsi="Wingdings" w:hint="default"/>
+      </w:rPr>
+    </w:lvl>
+    <w:lvl w:ilvl="3" w:tplc="08090001" w:tentative="1">
+      <w:start w:val="1"/>
+      <w:numFmt w:val="bullet"/>
+      <w:lvlText w:val=""/>
+      <w:lvlJc w:val="left"/>
+      <w:pPr>
+        <w:ind w:left="3240" w:hanging="360"/>
+      </w:pPr>
+      <w:rPr>
+        <w:rFonts w:ascii="Symbol" w:hAnsi="Symbol" w:hint="default"/>
+      </w:rPr>
+    </w:lvl>
+    <w:lvl w:ilvl="4" w:tplc="08090003" w:tentative="1">
+      <w:start w:val="1"/>
+      <w:numFmt w:val="bullet"/>
+      <w:lvlText w:val="o"/>
+      <w:lvlJc w:val="left"/>
+      <w:pPr>
+        <w:ind w:left="3960" w:hanging="360"/>
+      </w:pPr>
+      <w:rPr>
+        <w:rFonts w:ascii="Courier New" w:hAnsi="Courier New" w:cs="Courier New" w:hint="default"/>
+      </w:rPr>
+    </w:lvl>
+    <w:lvl w:ilvl="5" w:tplc="08090005" w:tentative="1">
+      <w:start w:val="1"/>
+      <w:numFmt w:val="bullet"/>
+      <w:lvlText w:val=""/>
+      <w:lvlJc w:val="left"/>
+      <w:pPr>
+        <w:ind w:left="4680" w:hanging="360"/>
+      </w:pPr>
+      <w:rPr>
+        <w:rFonts w:ascii="Wingdings" w:hAnsi="Wingdings" w:hint="default"/>
+      </w:rPr>
+    </w:lvl>
+    <w:lvl w:ilvl="6" w:tplc="08090001" w:tentative="1">
+      <w:start w:val="1"/>
+      <w:numFmt w:val="bullet"/>
+      <w:lvlText w:val=""/>
+      <w:lvlJc w:val="left"/>
+      <w:pPr>
+        <w:ind w:left="5400" w:hanging="360"/>
+      </w:pPr>
+      <w:rPr>
+        <w:rFonts w:ascii="Symbol" w:hAnsi="Symbol" w:hint="default"/>
+      </w:rPr>
+    </w:lvl>
+    <w:lvl w:ilvl="7" w:tplc="08090003" w:tentative="1">
+      <w:start w:val="1"/>
+      <w:numFmt w:val="bullet"/>
+      <w:lvlText w:val="o"/>
+      <w:lvlJc w:val="left"/>
+      <w:pPr>
+        <w:ind w:left="6120" w:hanging="360"/>
+      </w:pPr>
+      <w:rPr>
+        <w:rFonts w:ascii="Courier New" w:hAnsi="Courier New" w:cs="Courier New" w:hint="default"/>
+      </w:rPr>
+    </w:lvl>
+    <w:lvl w:ilvl="8" w:tplc="08090005" w:tentative="1">
+      <w:start w:val="1"/>
+      <w:numFmt w:val="bullet"/>
+      <w:lvlText w:val=""/>
+      <w:lvlJc w:val="left"/>
+      <w:pPr>
+        <w:ind w:left="6840" w:hanging="360"/>
+      </w:pPr>
+      <w:rPr>
+        <w:rFonts w:ascii="Wingdings" w:hAnsi="Wingdings" w:hint="default"/>
+      </w:rPr>
+    </w:lvl>
+  </w:abstractNum>
+  <w:abstractNum w:abstractNumId="5" w15:restartNumberingAfterBreak="0">
+    <w:nsid w:val="5B227D79"/>
+    <w:multiLevelType w:val="hybridMultilevel"/>
+    <w:tmpl w:val="CECE2D4C"/>
+    <w:lvl w:ilvl="0" w:tplc="F8881AFE">
+      <w:start w:val="7"/>
+      <w:numFmt w:val="bullet"/>
+      <w:lvlText w:val="•"/>
+      <w:lvlJc w:val="left"/>
+      <w:pPr>
+        <w:ind w:left="1080" w:hanging="360"/>
+      </w:pPr>
+      <w:rPr>
+        <w:rFonts w:ascii="Aptos" w:eastAsiaTheme="minorHAnsi" w:hAnsi="Aptos" w:cstheme="minorBidi" w:hint="default"/>
+        <w:b/>
+      </w:rPr>
+    </w:lvl>
+    <w:lvl w:ilvl="1" w:tplc="08090003" w:tentative="1">
+      <w:start w:val="1"/>
+      <w:numFmt w:val="bullet"/>
+      <w:lvlText w:val="o"/>
+      <w:lvlJc w:val="left"/>
+      <w:pPr>
+        <w:ind w:left="1800" w:hanging="360"/>
+      </w:pPr>
+      <w:rPr>
+        <w:rFonts w:ascii="Courier New" w:hAnsi="Courier New" w:cs="Courier New" w:hint="default"/>
+      </w:rPr>
+    </w:lvl>
+    <w:lvl w:ilvl="2" w:tplc="08090005" w:tentative="1">
+      <w:start w:val="1"/>
+      <w:numFmt w:val="bullet"/>
+      <w:lvlText w:val=""/>
+      <w:lvlJc w:val="left"/>
+      <w:pPr>
+        <w:ind w:left="2520" w:hanging="360"/>
+      </w:pPr>
+      <w:rPr>
+        <w:rFonts w:ascii="Wingdings" w:hAnsi="Wingdings" w:hint="default"/>
+      </w:rPr>
+    </w:lvl>
+    <w:lvl w:ilvl="3" w:tplc="08090001" w:tentative="1">
+      <w:start w:val="1"/>
+      <w:numFmt w:val="bullet"/>
+      <w:lvlText w:val=""/>
+      <w:lvlJc w:val="left"/>
+      <w:pPr>
+        <w:ind w:left="3240" w:hanging="360"/>
+      </w:pPr>
+      <w:rPr>
+        <w:rFonts w:ascii="Symbol" w:hAnsi="Symbol" w:hint="default"/>
+      </w:rPr>
+    </w:lvl>
+    <w:lvl w:ilvl="4" w:tplc="08090003" w:tentative="1">
+      <w:start w:val="1"/>
+      <w:numFmt w:val="bullet"/>
+      <w:lvlText w:val="o"/>
+      <w:lvlJc w:val="left"/>
+      <w:pPr>
+        <w:ind w:left="3960" w:hanging="360"/>
+      </w:pPr>
+      <w:rPr>
+        <w:rFonts w:ascii="Courier New" w:hAnsi="Courier New" w:cs="Courier New" w:hint="default"/>
+      </w:rPr>
+    </w:lvl>
+    <w:lvl w:ilvl="5" w:tplc="08090005" w:tentative="1">
+      <w:start w:val="1"/>
+      <w:numFmt w:val="bullet"/>
+      <w:lvlText w:val=""/>
+      <w:lvlJc w:val="left"/>
+      <w:pPr>
+        <w:ind w:left="4680" w:hanging="360"/>
+      </w:pPr>
+      <w:rPr>
+        <w:rFonts w:ascii="Wingdings" w:hAnsi="Wingdings" w:hint="default"/>
+      </w:rPr>
+    </w:lvl>
+    <w:lvl w:ilvl="6" w:tplc="08090001" w:tentative="1">
+      <w:start w:val="1"/>
+      <w:numFmt w:val="bullet"/>
+      <w:lvlText w:val=""/>
+      <w:lvlJc w:val="left"/>
+      <w:pPr>
+        <w:ind w:left="5400" w:hanging="360"/>
+      </w:pPr>
+      <w:rPr>
+        <w:rFonts w:ascii="Symbol" w:hAnsi="Symbol" w:hint="default"/>
+      </w:rPr>
+    </w:lvl>
+    <w:lvl w:ilvl="7" w:tplc="08090003" w:tentative="1">
+      <w:start w:val="1"/>
+      <w:numFmt w:val="bullet"/>
+      <w:lvlText w:val="o"/>
+      <w:lvlJc w:val="left"/>
+      <w:pPr>
+        <w:ind w:left="6120" w:hanging="360"/>
+      </w:pPr>
+      <w:rPr>
+        <w:rFonts w:ascii="Courier New" w:hAnsi="Courier New" w:cs="Courier New" w:hint="default"/>
+      </w:rPr>
+    </w:lvl>
+    <w:lvl w:ilvl="8" w:tplc="08090005" w:tentative="1">
+      <w:start w:val="1"/>
+      <w:numFmt w:val="bullet"/>
+      <w:lvlText w:val=""/>
+      <w:lvlJc w:val="left"/>
+      <w:pPr>
+        <w:ind w:left="6840" w:hanging="360"/>
+      </w:pPr>
+      <w:rPr>
+        <w:rFonts w:ascii="Wingdings" w:hAnsi="Wingdings" w:hint="default"/>
+      </w:rPr>
+    </w:lvl>
+  </w:abstractNum>
+  <w:abstractNum w:abstractNumId="6" w15:restartNumberingAfterBreak="0">
+    <w:nsid w:val="6B404263"/>
+    <w:multiLevelType w:val="hybridMultilevel"/>
+    <w:tmpl w:val="1A3E3396"/>
+    <w:lvl w:ilvl="0" w:tplc="08090001">
+      <w:start w:val="1"/>
+      <w:numFmt w:val="bullet"/>
+      <w:lvlText w:val=""/>
+      <w:lvlJc w:val="left"/>
+      <w:pPr>
+        <w:ind w:left="1080" w:hanging="360"/>
+      </w:pPr>
+      <w:rPr>
+        <w:rFonts w:ascii="Symbol" w:hAnsi="Symbol" w:hint="default"/>
+      </w:rPr>
+    </w:lvl>
+    <w:lvl w:ilvl="1" w:tplc="08090003" w:tentative="1">
+      <w:start w:val="1"/>
+      <w:numFmt w:val="bullet"/>
+      <w:lvlText w:val="o"/>
+      <w:lvlJc w:val="left"/>
+      <w:pPr>
+        <w:ind w:left="1800" w:hanging="360"/>
+      </w:pPr>
+      <w:rPr>
+        <w:rFonts w:ascii="Courier New" w:hAnsi="Courier New" w:cs="Courier New" w:hint="default"/>
+      </w:rPr>
+    </w:lvl>
+    <w:lvl w:ilvl="2" w:tplc="08090005" w:tentative="1">
+      <w:start w:val="1"/>
+      <w:numFmt w:val="bullet"/>
+      <w:lvlText w:val=""/>
+      <w:lvlJc w:val="left"/>
+      <w:pPr>
+        <w:ind w:left="2520" w:hanging="360"/>
+      </w:pPr>
+      <w:rPr>
+        <w:rFonts w:ascii="Wingdings" w:hAnsi="Wingdings" w:hint="default"/>
+      </w:rPr>
+    </w:lvl>
+    <w:lvl w:ilvl="3" w:tplc="08090001" w:tentative="1">
+      <w:start w:val="1"/>
+      <w:numFmt w:val="bullet"/>
+      <w:lvlText w:val=""/>
+      <w:lvlJc w:val="left"/>
+      <w:pPr>
+        <w:ind w:left="3240" w:hanging="360"/>
+      </w:pPr>
+      <w:rPr>
+        <w:rFonts w:ascii="Symbol" w:hAnsi="Symbol" w:hint="default"/>
+      </w:rPr>
+    </w:lvl>
+    <w:lvl w:ilvl="4" w:tplc="08090003" w:tentative="1">
+      <w:start w:val="1"/>
+      <w:numFmt w:val="bullet"/>
+      <w:lvlText w:val="o"/>
+      <w:lvlJc w:val="left"/>
+      <w:pPr>
+        <w:ind w:left="3960" w:hanging="360"/>
+      </w:pPr>
+      <w:rPr>
+        <w:rFonts w:ascii="Courier New" w:hAnsi="Courier New" w:cs="Courier New" w:hint="default"/>
+      </w:rPr>
+    </w:lvl>
+    <w:lvl w:ilvl="5" w:tplc="08090005" w:tentative="1">
+      <w:start w:val="1"/>
+      <w:numFmt w:val="bullet"/>
+      <w:lvlText w:val=""/>
+      <w:lvlJc w:val="left"/>
+      <w:pPr>
+        <w:ind w:left="4680" w:hanging="360"/>
+      </w:pPr>
+      <w:rPr>
+        <w:rFonts w:ascii="Wingdings" w:hAnsi="Wingdings" w:hint="default"/>
+      </w:rPr>
+    </w:lvl>
+    <w:lvl w:ilvl="6" w:tplc="08090001" w:tentative="1">
+      <w:start w:val="1"/>
+      <w:numFmt w:val="bullet"/>
+      <w:lvlText w:val=""/>
+      <w:lvlJc w:val="left"/>
+      <w:pPr>
+        <w:ind w:left="5400" w:hanging="360"/>
+      </w:pPr>
+      <w:rPr>
+        <w:rFonts w:ascii="Symbol" w:hAnsi="Symbol" w:hint="default"/>
+      </w:rPr>
+    </w:lvl>
+    <w:lvl w:ilvl="7" w:tplc="08090003" w:tentative="1">
+      <w:start w:val="1"/>
+      <w:numFmt w:val="bullet"/>
+      <w:lvlText w:val="o"/>
+      <w:lvlJc w:val="left"/>
+      <w:pPr>
+        <w:ind w:left="6120" w:hanging="360"/>
+      </w:pPr>
+      <w:rPr>
+        <w:rFonts w:ascii="Courier New" w:hAnsi="Courier New" w:cs="Courier New" w:hint="default"/>
+      </w:rPr>
+    </w:lvl>
+    <w:lvl w:ilvl="8" w:tplc="08090005" w:tentative="1">
+      <w:start w:val="1"/>
+      <w:numFmt w:val="bullet"/>
+      <w:lvlText w:val=""/>
+      <w:lvlJc w:val="left"/>
+      <w:pPr>
+        <w:ind w:left="6840" w:hanging="360"/>
+      </w:pPr>
+      <w:rPr>
+        <w:rFonts w:ascii="Wingdings" w:hAnsi="Wingdings" w:hint="default"/>
+      </w:rPr>
+    </w:lvl>
+  </w:abstractNum>
+  <w:abstractNum w:abstractNumId="7" w15:restartNumberingAfterBreak="0">
     <w:nsid w:val="73E608CF"/>
     <w:multiLevelType w:val="multilevel"/>
     <w:tmpl w:val="3B78D928"/>
@@ -1570,7 +2491,7 @@
     <w:abstractNumId w:val="2"/>
   </w:num>
   <w:num w:numId="2" w16cid:durableId="725377661">
-    <w:abstractNumId w:val="4"/>
+    <w:abstractNumId w:val="7"/>
   </w:num>
   <w:num w:numId="3" w16cid:durableId="1928533991">
     <w:abstractNumId w:val="3"/>
@@ -1580,6 +2501,15 @@
   </w:num>
   <w:num w:numId="5" w16cid:durableId="986008150">
     <w:abstractNumId w:val="1"/>
+  </w:num>
+  <w:num w:numId="6" w16cid:durableId="1284116868">
+    <w:abstractNumId w:val="4"/>
+  </w:num>
+  <w:num w:numId="7" w16cid:durableId="592864785">
+    <w:abstractNumId w:val="6"/>
+  </w:num>
+  <w:num w:numId="8" w16cid:durableId="910625418">
+    <w:abstractNumId w:val="5"/>
   </w:num>
 </w:numbering>
 </file>
@@ -2501,6 +3431,148 @@
       <w:spacing w:val="5"/>
     </w:rPr>
   </w:style>
+  <w:style w:type="paragraph" w:customStyle="1" w:styleId="Compact">
+    <w:name w:val="Compact"/>
+    <w:basedOn w:val="BodyText"/>
+    <w:qFormat/>
+    <w:rsid w:val="003744DE"/>
+    <w:pPr>
+      <w:spacing w:before="36" w:after="36" w:line="240" w:lineRule="auto"/>
+    </w:pPr>
+    <w:rPr>
+      <w:kern w:val="0"/>
+      <w:lang w:val="en-US"/>
+      <w14:ligatures w14:val="none"/>
+    </w:rPr>
+  </w:style>
+  <w:style w:type="table" w:customStyle="1" w:styleId="Table">
+    <w:name w:val="Table"/>
+    <w:semiHidden/>
+    <w:unhideWhenUsed/>
+    <w:qFormat/>
+    <w:rsid w:val="003744DE"/>
+    <w:pPr>
+      <w:spacing w:after="200" w:line="240" w:lineRule="auto"/>
+    </w:pPr>
+    <w:rPr>
+      <w:kern w:val="0"/>
+      <w:sz w:val="20"/>
+      <w:szCs w:val="20"/>
+      <w:lang w:val="en-US" w:eastAsia="en-GB"/>
+      <w14:ligatures w14:val="none"/>
+    </w:rPr>
+    <w:tblPr>
+      <w:tblInd w:w="0" w:type="dxa"/>
+      <w:tblCellMar>
+        <w:top w:w="0" w:type="dxa"/>
+        <w:left w:w="108" w:type="dxa"/>
+        <w:bottom w:w="0" w:type="dxa"/>
+        <w:right w:w="108" w:type="dxa"/>
+      </w:tblCellMar>
+    </w:tblPr>
+    <w:tblStylePr w:type="firstRow">
+      <w:tblPr>
+        <w:jc w:val="left"/>
+      </w:tblPr>
+      <w:trPr>
+        <w:jc w:val="left"/>
+      </w:trPr>
+      <w:tcPr>
+        <w:tcBorders>
+          <w:bottom w:val="single" w:sz="0" w:space="0" w:color="auto"/>
+        </w:tcBorders>
+        <w:vAlign w:val="bottom"/>
+      </w:tcPr>
+    </w:tblStylePr>
+  </w:style>
+  <w:style w:type="character" w:customStyle="1" w:styleId="VerbatimChar">
+    <w:name w:val="Verbatim Char"/>
+    <w:basedOn w:val="DefaultParagraphFont"/>
+    <w:link w:val="SourceCode"/>
+    <w:rsid w:val="003744DE"/>
+    <w:rPr>
+      <w:rFonts w:ascii="Consolas" w:hAnsi="Consolas"/>
+      <w:sz w:val="22"/>
+    </w:rPr>
+  </w:style>
+  <w:style w:type="paragraph" w:customStyle="1" w:styleId="SourceCode">
+    <w:name w:val="Source Code"/>
+    <w:basedOn w:val="Normal"/>
+    <w:link w:val="VerbatimChar"/>
+    <w:rsid w:val="003744DE"/>
+    <w:pPr>
+      <w:wordWrap w:val="0"/>
+      <w:spacing w:after="200" w:line="240" w:lineRule="auto"/>
+    </w:pPr>
+    <w:rPr>
+      <w:rFonts w:ascii="Consolas" w:hAnsi="Consolas"/>
+      <w:sz w:val="22"/>
+    </w:rPr>
+  </w:style>
+  <w:style w:type="paragraph" w:styleId="BodyText">
+    <w:name w:val="Body Text"/>
+    <w:basedOn w:val="Normal"/>
+    <w:link w:val="BodyTextChar"/>
+    <w:uiPriority w:val="99"/>
+    <w:semiHidden/>
+    <w:unhideWhenUsed/>
+    <w:rsid w:val="003744DE"/>
+    <w:pPr>
+      <w:spacing w:after="120"/>
+    </w:pPr>
+  </w:style>
+  <w:style w:type="character" w:customStyle="1" w:styleId="BodyTextChar">
+    <w:name w:val="Body Text Char"/>
+    <w:basedOn w:val="DefaultParagraphFont"/>
+    <w:link w:val="BodyText"/>
+    <w:uiPriority w:val="99"/>
+    <w:semiHidden/>
+    <w:rsid w:val="003744DE"/>
+  </w:style>
+  <w:style w:type="paragraph" w:styleId="Header">
+    <w:name w:val="header"/>
+    <w:basedOn w:val="Normal"/>
+    <w:link w:val="HeaderChar"/>
+    <w:uiPriority w:val="99"/>
+    <w:unhideWhenUsed/>
+    <w:rsid w:val="003744DE"/>
+    <w:pPr>
+      <w:tabs>
+        <w:tab w:val="center" w:pos="4513"/>
+        <w:tab w:val="right" w:pos="9026"/>
+      </w:tabs>
+      <w:spacing w:after="0" w:line="240" w:lineRule="auto"/>
+    </w:pPr>
+  </w:style>
+  <w:style w:type="character" w:customStyle="1" w:styleId="HeaderChar">
+    <w:name w:val="Header Char"/>
+    <w:basedOn w:val="DefaultParagraphFont"/>
+    <w:link w:val="Header"/>
+    <w:uiPriority w:val="99"/>
+    <w:rsid w:val="003744DE"/>
+  </w:style>
+  <w:style w:type="paragraph" w:styleId="Footer">
+    <w:name w:val="footer"/>
+    <w:basedOn w:val="Normal"/>
+    <w:link w:val="FooterChar"/>
+    <w:uiPriority w:val="99"/>
+    <w:unhideWhenUsed/>
+    <w:rsid w:val="003744DE"/>
+    <w:pPr>
+      <w:tabs>
+        <w:tab w:val="center" w:pos="4513"/>
+        <w:tab w:val="right" w:pos="9026"/>
+      </w:tabs>
+      <w:spacing w:after="0" w:line="240" w:lineRule="auto"/>
+    </w:pPr>
+  </w:style>
+  <w:style w:type="character" w:customStyle="1" w:styleId="FooterChar">
+    <w:name w:val="Footer Char"/>
+    <w:basedOn w:val="DefaultParagraphFont"/>
+    <w:link w:val="Footer"/>
+    <w:uiPriority w:val="99"/>
+    <w:rsid w:val="003744DE"/>
+  </w:style>
 </w:styles>
 </file>
 

</xml_diff>